<commit_message>
Add junior CMP book-selection records and refresh Term 2 assessments.
Publish EDB-ready meeting minutes, updated textbook-change forms, and
generation scripts. Finalize S3 practical paper and starter; add S5 ICT Exam02 PDF.
</commit_message>
<xml_diff>
--- a/Administrative/TechEd/15_Booklist_materialPlanning/25_26_S2-3CMP_更改課本原因.docx
+++ b/Administrative/TechEd/15_Booklist_materialPlanning/25_26_S2-3CMP_更改課本原因.docx
@@ -216,10 +216,7 @@
         <w:jc w:val="both"/>
       </w:pPr>
       <w:r>
-        <w:rPr>
-          <w:rFonts w:ascii="PMingLiU" w:hAnsi="PMingLiU"/>
-        </w:rPr>
-        <w:t>參考教育局的適用書目表，出版科技教育課程下相關課題之出版社有「香港大學電機電子工程系」（下稱出版社A）及「卓思出版社有限公司」（下稱出版社B）。就「生成式人工智能」此一新興課題，出版社 B 未有完全匹配之課本；出版社 A 提供之《明德電腦——生成式人工智能》（2026版本）內容切合本校課程安排，為現時最新版本，而適用書目表中評語亦屬正面。</w:t>
+        <w:t>參考教育局的適用書目表，出版科技教育課程的出版社包括「香港大學電機電子工程系」（下稱出版社A）及「卓思出版社有限公司」（下稱出版社B）。本校中二「生成式人工智能」單元內容緊貼現時科技發展，屬新興課題；就相關內容而言，出版社A及出版社B目前均未有載列於適用書目表、且能完全配合本校課程編排之獲批課本。由於教材送審與批核需時，短期內難以趕及編課需要，此與科技教育範疇更新迅速有關。基於上述情況，學校現申請繼續採用出版社A透過 iClass 提供之《明德電腦——生成式人工智能》（2026版本）；該課本內容切合本校課程安排，供學生上課及課後使用，直至適用書目表有相應獲批課本可供選用。</w:t>
       </w:r>
     </w:p>
     <w:p>
@@ -284,10 +281,7 @@
     <w:p/>
     <w:p>
       <w:r>
-        <w:rPr>
-          <w:rFonts w:ascii="PMingLiU" w:hAnsi="PMingLiU"/>
-        </w:rPr>
-        <w:t>現申請下年度（2026-2027年度）使用卓思出版社有限公司（iClass）之電子課本，包括：</w:t>
+        <w:t>現申請下年度（2026-2027年度）使用《初中 AI and Python》（2023版本）（iClass eBook；送呈書單之出版社為香港大學電子學習發展實驗室），包括：</w:t>
       </w:r>
     </w:p>
     <w:p>
@@ -389,10 +383,7 @@
         <w:ind w:leftChars="0" w:left="567" w:hanging="567"/>
       </w:pPr>
       <w:r>
-        <w:rPr>
-          <w:rFonts w:ascii="PMingLiU" w:hAnsi="PMingLiU"/>
-        </w:rPr>
-        <w:t>參考教育局的適用書目表，出版科技教育課程下相關課題之出版社有「香港大學電機電子工程系」（下稱出版社A）及「卓思出版社有限公司」（下稱出版社B）。就「Python 與人工智能」此課題，出版社 A 未有完全匹配之初中課本；出版社 B 透過 iClass 提供之《初中 AI and Python》（2023版本）內容切合本校課程安排，章節及實驗活動與校本教學進度相若，而適用書目表中評語亦屬正面。</w:t>
+        <w:t>參考教育局的適用書目表，出版科技教育課程的出版社包括「香港大學電機電子工程系」（下稱出版社A）及「卓思出版社有限公司」（下稱出版社B）。本校中三「Python 與人工智能」單元同樣涵蓋程式設計、電腦視覺及人工智能應用等發展迅速的內容；就相關課題而言，出版社A及出版社B目前均未有載列於適用書目表、且能完全配合本校初中課程之獲批課本。教材送審與批核需時，難以配合校本教學進度，此與科技發展快於教材審批周期有關。基於上述情況，學校現申請繼續採用《初中 AI and Python》（2023版本）（iClass eBook）；送呈書單之出版社為「香港大學電子學習發展實驗室」，章節及實驗活動與校本教學進度相若，供學生上課、課後閱讀及溫習，直至適用書目表有相應獲批課本可供選用。</w:t>
       </w:r>
     </w:p>
     <w:p>

</xml_diff>